<commit_message>
docs: the tool suggests gaps, it does not find them
Supervisor's note on the WIP report. Every claim about what the tool does
with gaps now says suggest: the objective in Table 1, section 11.5 and its
measurement, the 12.6 adaptation, the schedule row, Figure 9's caption and
the title page. "Suggested gaps are 87.8% precise" rather than "gap
discovery achieves"; the tool suggests literal gap statements at high
precision and low recall rather than detecting them.

Left alone deliberately: the span verifier's "quote was found", which is a
different claim about locating a sentence; "Found empirically", which is
the author's own finding; section 5's template heading; and Gap 3's name
from Assessment 1, which is a gap in the literature rather than an output.

5,484 words.

Co-Authored-By: Claude Opus 5 <noreply@anthropic.com>
</commit_message>
<xml_diff>
--- a/reports/MSE907-2-WIP-Report.docx
+++ b/reports/MSE907-2-WIP-Report.docx
@@ -29,7 +29,7 @@
           <w:sz w:val="26"/>
           <w:szCs w:val="26"/>
         </w:rPr>
-        <w:t xml:space="preserve">An LLM-Supported Tool for Literature Discovery and Research Gap Detection</w:t>
+        <w:t>An LLM-Supported Tool for Literature Discovery and Research Gap Suggestion</w:t>
       </w:r>
     </w:p>
     <w:p>
@@ -276,7 +276,7 @@
           <w:sz w:val="22"/>
           <w:szCs w:val="22"/>
         </w:rPr>
-        <w:t>This report describes progress on Beyond Retrieval, a locally runnable tool that takes a researcher's question, finds the papers worth reading, reports whether other authors already name that question as an open research gap, and extracts structured data from the papers selected. It is submitted in week 13 of a fifteen-week capstone by one developer at roughly twelve hours a week, building on Assessment 1.</w:t>
+        <w:t>This report describes progress on Beyond Retrieval, a locally runnable tool that takes a researcher's question, suggests the papers worth reading, reports whether other authors already name that question as an open research gap, and extracts structured data from the papers selected. It is submitted in week 13 of a fifteen-week capstone by one developer at roughly twelve hours a week, building on Assessment 1.</w:t>
       </w:r>
     </w:p>
     <w:p>
@@ -370,7 +370,7 @@
           <w:sz w:val="22"/>
           <w:szCs w:val="22"/>
         </w:rPr>
-        <w:t>These combine into one problem. A model's screening decision cannot currently be checked by the researcher who depends on it: there is no mechanism short of re-reading the paper to establish whether the verdict rests on anything the paper says. The problem is therefore not whether a model screens accurately, but whether its output can be made independently verifiable, and whether the same discipline can surface the gaps authors state themselves.</w:t>
+        <w:t>These combine into one problem. A model's screening decision cannot currently be checked by the researcher who depends on it: there is no mechanism short of re-reading the paper to establish whether the verdict rests on anything the paper says. The problem is therefore not whether a model screens accurately, but whether its output can be made independently verifiable, and whether the same discipline can suggest the gaps authors state themselves.</w:t>
       </w:r>
     </w:p>
     <w:p>
@@ -1021,7 +1021,7 @@
                 <w:sz w:val="18"/>
                 <w:szCs w:val="18"/>
               </w:rPr>
-              <w:t>Detect research gaps stated in abstracts and measure precision and recall</w:t>
+              <w:t>Suggest research gaps stated in abstracts and measure precision and recall</w:t>
             </w:r>
           </w:p>
         </w:tc>
@@ -1552,7 +1552,7 @@
           <w:sz w:val="22"/>
           <w:szCs w:val="22"/>
         </w:rPr>
-        <w:t xml:space="preserve"> Addressed and measured. Gap discovery achieves 87.8% precision over 74 rated statements, but blind-labelled recall is between roughly 0.40 and 1.00 depending on the review: a high-precision, low-recall detector of literal gap statements.</w:t>
+        <w:t xml:space="preserve"> Addressed and measured. Suggested gaps are 87.8% precise over 74 rated statements, but blind-labelled recall is between roughly 0.40 and 1.00 depending on the review: the tool suggests literal gap statements with high precision and low recall.</w:t>
       </w:r>
     </w:p>
     <w:p>
@@ -2124,7 +2124,7 @@
           <w:sz w:val="22"/>
           <w:szCs w:val="22"/>
         </w:rPr>
-        <w:t xml:space="preserve"> How much reviewing effort, time and cost does the system remove at a fixed level of recall, and can it surface the gaps authors state in their own papers? Where a missed paper costs far more than a false positive, effort saved is always reported at a fixed recall target.</w:t>
+        <w:t xml:space="preserve"> How much reviewing effort, time and cost does the system remove at a fixed level of recall, and can it suggest the gaps authors state in their own papers? Where a missed paper costs far more than a false positive, effort saved is always reported at a fixed recall target.</w:t>
       </w:r>
     </w:p>
     <w:p>
@@ -8500,7 +8500,7 @@
           <w:sz w:val="24"/>
           <w:szCs w:val="24"/>
         </w:rPr>
-        <w:t xml:space="preserve">11.5 Gap discovery: precision and recall together</w:t>
+        <w:t>11.5 Gap suggestion: precision and recall together</w:t>
       </w:r>
     </w:p>
     <w:p>
@@ -8513,7 +8513,7 @@
           <w:sz w:val="22"/>
           <w:szCs w:val="22"/>
         </w:rPr>
-        <w:t>Gap discovery was rated over 74 statements across all six reviews, each judged against the full abstract under a rule fixed in advance: 87.8% precision, or 75.7% excluding statements naming a gap the same paper then fills. Recall was estimated by blind-labelling a seeded sample of records the model marked as stating no gap, and ranges from 0.40 to 1.00 across four reviews, with 95% Wilson intervals wide enough to indicate direction only. Most sampled misses are motivating gaps — “little is known about” — which the prompt suppresses.</w:t>
+        <w:t>Suggested gaps were rated over 74 statements across all six reviews, each judged against the full abstract under a rule fixed in advance: 87.8% precision, or 75.7% excluding statements naming a gap the same paper then fills. Recall was estimated by blind-labelling a seeded sample of records the model marked as stating no gap, and ranges from 0.40 to 1.00 across four reviews, with 95% Wilson intervals wide enough to indicate direction only. Most sampled misses are motivating gaps — “little is known about” — which the prompt suppresses.</w:t>
       </w:r>
     </w:p>
     <w:p>
@@ -8853,7 +8853,7 @@
           <w:sz w:val="22"/>
           <w:szCs w:val="22"/>
         </w:rPr>
-        <w:t>Research culture differs by discipline. The measured gap-statement rate varies from 3.8% to 52.2% across the six reviews and tracks the genre of the abstract rather than prevalence: environmental-health reviews conventionally close with “further studies are needed”, whereas software engineering abstracts rarely state gaps at all. Reporting “no gaps found” to a software engineering researcher would report a writing convention as a finding.</w:t>
+        <w:t>Research culture differs by discipline. The measured gap-statement rate varies from 3.8% to 52.2% across the six reviews and tracks the genre of the abstract rather than prevalence: environmental-health reviews conventionally close with “further studies are needed”, whereas software engineering abstracts rarely state gaps at all. Telling a software engineering researcher that no gaps were stated would report a writing convention as a finding.</w:t>
       </w:r>
     </w:p>
     <w:p>
@@ -8866,7 +8866,7 @@
           <w:sz w:val="22"/>
           <w:szCs w:val="22"/>
         </w:rPr>
-        <w:t>Three adaptations follow. The extraction schema should be configurable per discipline. Gap detection should report the discipline's base rate alongside any result, so an absence is read as a convention rather than a conclusion. And because the tool runs locally at zero marginal cost, it is usable without institutional subscriptions, a deliberate equity property of the design.</w:t>
+        <w:t>Three adaptations follow. The extraction schema should be configurable per discipline. Gap suggestion should report the discipline's base rate alongside any result, so an absence is read as a convention rather than a conclusion. And because the tool runs locally at zero marginal cost, it is usable without institutional subscriptions, a deliberate equity property of the design.</w:t>
       </w:r>
     </w:p>
     <w:p>
@@ -9395,7 +9395,7 @@
                 <w:sz w:val="18"/>
                 <w:szCs w:val="18"/>
               </w:rPr>
-              <w:t xml:space="preserve">Gap discovery and go/no-go checkpoint</w:t>
+              <w:t>Gap suggestion and go/no-go checkpoint</w:t>
             </w:r>
           </w:p>
         </w:tc>
@@ -9985,7 +9985,7 @@
           <w:sz w:val="22"/>
           <w:szCs w:val="22"/>
         </w:rPr>
-        <w:t>Comparative retrieval evaluation against random, lexical, dense, hybrid and cross-encoder strategies plus ASReview; an exact ablation of the verification mechanism over all 12,598 decisions; and a blind-sampled recall estimate for gap discovery with confidence intervals.</w:t>
+        <w:t>Comparative retrieval evaluation against random, lexical, dense, hybrid and cross-encoder strategies plus ASReview; an exact ablation of the verification mechanism over all 12,598 decisions; and a blind-sampled recall estimate for gap suggestion with confidence intervals.</w:t>
       </w:r>
     </w:p>
     <w:p>
@@ -10016,7 +10016,7 @@
           <w:sz w:val="22"/>
           <w:szCs w:val="22"/>
         </w:rPr>
-        <w:t>Five items remain open: the usability exit test requiring a second participant; the ethics application; a hand-rating pass validating the automatic failure classifications; a second-model gap-discovery arm, built and costed at approximately USD 0.26; and precision and recall for gaps read from full text.</w:t>
+        <w:t>Five items remain open: the usability exit test requiring a second participant; the ethics application; a hand-rating pass validating the automatic failure classifications; a second-model gap-suggestion arm, built and costed at approximately USD 0.26; and precision and recall for gaps suggested from full text.</w:t>
       </w:r>
     </w:p>
     <w:p>
@@ -10348,7 +10348,7 @@
     <w:p>
       <w:pPr/>
       <w:r>
-        <w:t>These three figures are a second example, captured on 25 October 2026 at commit 442559c, the state submitted, using a question a reader can check against the live literature: “Do probiotics reduce symptoms of irritable bowel syndrome in adults?” The run ranked 50 candidates, suggested 20, judged 12 as addressing the question and found 5 papers stating a research gap, at USD 0.00. The six walkthrough figures in section 9.3 were captured on 20 October 2026 at commit 3d20965, before the gap block of section 11.6 was added, which is why it does not appear in Figure 7.</w:t>
+        <w:t>These three figures are a second example, captured on 25 October 2026 at commit 442559c, the state submitted, using a question a reader can check against the live literature: “Do probiotics reduce symptoms of irritable bowel syndrome in adults?” The run ranked 50 candidates, suggested 20 and judged 12 as addressing the question, 5 of which state a research gap, at USD 0.00. The six walkthrough figures in section 9.3 were captured on 20 October 2026 at commit 3d20965, before the gap block of section 11.6 was added, which is why it does not appear in Figure 7.</w:t>
       </w:r>
     </w:p>
     <w:p>
@@ -10397,7 +10397,7 @@
           <w:i/>
           <w:sz w:val="18"/>
         </w:rPr>
-        <w:t>Figure 9. The front door; the guest path keeps search, screening and gap discovery open.</w:t>
+        <w:t>Figure 9. The front door; the guest path keeps search, screening and gap suggestion open.</w:t>
       </w:r>
     </w:p>
     <w:p>

</xml_diff>